<commit_message>
feat(api-gateway): enable configurable request logging
- Added `requestLoggingEnabled` configuration option to control request logging behavior.
- Updated `RequestLoggingInterceptor` to respect the new configuration setting.
- Modified `gateway.config.ts` to parse the new environment variable `API_GATEWAY_REQUEST_LOGGING`.
- Updated `route-config.types.ts` to include the new `requestLoggingEnabled` property in the `GatewayConfig` interface.

chore(deps): update dependencies and add new packages

- Added `@google/genai` package and updated related dependencies in `pnpm-lock.yaml`.
- Updated various dependencies to their latest versions, including `ws`, `protobufjs`, and others.
- Added new peer dependencies and transitive dependencies for improved compatibility and functionality.
</commit_message>
<xml_diff>
--- a/Sentient_Technical_Guide.docx
+++ b/Sentient_Technical_Guide.docx
@@ -1091,7 +1091,7 @@
                 <w:sz w:val="20"/>
                 <w:szCs w:val="20"/>
               </w:rPr>
-              <w:t xml:space="preserve">LLM</w:t>
+              <w:t xml:space="preserve">LLM (primary)</w:t>
             </w:r>
           </w:p>
         </w:tc>
@@ -1165,7 +1165,7 @@
                 <w:sz w:val="20"/>
                 <w:szCs w:val="20"/>
               </w:rPr>
-              <w:t xml:space="preserve">Monorepo tool</w:t>
+              <w:t xml:space="preserve">LLM fallbacks</w:t>
             </w:r>
           </w:p>
         </w:tc>
@@ -1189,7 +1189,7 @@
                 <w:sz w:val="20"/>
                 <w:szCs w:val="20"/>
               </w:rPr>
-              <w:t xml:space="preserve">Turborepo</w:t>
+              <w:t xml:space="preserve">Groq · OpenRouter · xAI (Grok)</w:t>
             </w:r>
           </w:p>
         </w:tc>
@@ -1213,7 +1213,7 @@
                 <w:sz w:val="20"/>
                 <w:szCs w:val="20"/>
               </w:rPr>
-              <w:t xml:space="preserve">Runs and builds all the sub-projects together, fast.</w:t>
+              <w:t xml:space="preserve">OpenAI-compatible back-ups, tried automatically if Gemini is down or unset.</w:t>
             </w:r>
           </w:p>
         </w:tc>
@@ -1239,7 +1239,7 @@
                 <w:sz w:val="20"/>
                 <w:szCs w:val="20"/>
               </w:rPr>
-              <w:t xml:space="preserve">Packaging</w:t>
+              <w:t xml:space="preserve">Monorepo tool</w:t>
             </w:r>
           </w:p>
         </w:tc>
@@ -1263,7 +1263,7 @@
                 <w:sz w:val="20"/>
                 <w:szCs w:val="20"/>
               </w:rPr>
-              <w:t xml:space="preserve">pnpm workspaces</w:t>
+              <w:t xml:space="preserve">Turborepo</w:t>
             </w:r>
           </w:p>
         </w:tc>
@@ -1271,6 +1271,80 @@
           <w:tcPr>
             <w:tcW w:type="dxa" w:w="5460"/>
             <w:shd w:fill="FFFFFF" w:val="clear"/>
+            <w:tcMar>
+              <w:top w:type="dxa" w:w="70"/>
+              <w:left w:type="dxa" w:w="120"/>
+              <w:bottom w:type="dxa" w:w="70"/>
+              <w:right w:type="dxa" w:w="120"/>
+            </w:tcMar>
+          </w:tcPr>
+          <w:p>
+            <w:pPr>
+              <w:spacing w:after="0" w:line="252"/>
+            </w:pPr>
+            <w:r>
+              <w:rPr>
+                <w:sz w:val="20"/>
+                <w:szCs w:val="20"/>
+              </w:rPr>
+              <w:t xml:space="preserve">Runs and builds all the sub-projects together, fast.</w:t>
+            </w:r>
+          </w:p>
+        </w:tc>
+      </w:tr>
+      <w:tr>
+        <w:tc>
+          <w:tcPr>
+            <w:tcW w:type="dxa" w:w="1500"/>
+            <w:shd w:fill="F2F6FB" w:val="clear"/>
+            <w:tcMar>
+              <w:top w:type="dxa" w:w="70"/>
+              <w:left w:type="dxa" w:w="120"/>
+              <w:bottom w:type="dxa" w:w="70"/>
+              <w:right w:type="dxa" w:w="120"/>
+            </w:tcMar>
+          </w:tcPr>
+          <w:p>
+            <w:pPr>
+              <w:spacing w:after="0" w:line="252"/>
+            </w:pPr>
+            <w:r>
+              <w:rPr>
+                <w:sz w:val="20"/>
+                <w:szCs w:val="20"/>
+              </w:rPr>
+              <w:t xml:space="preserve">Packaging</w:t>
+            </w:r>
+          </w:p>
+        </w:tc>
+        <w:tc>
+          <w:tcPr>
+            <w:tcW w:type="dxa" w:w="2400"/>
+            <w:shd w:fill="F2F6FB" w:val="clear"/>
+            <w:tcMar>
+              <w:top w:type="dxa" w:w="70"/>
+              <w:left w:type="dxa" w:w="120"/>
+              <w:bottom w:type="dxa" w:w="70"/>
+              <w:right w:type="dxa" w:w="120"/>
+            </w:tcMar>
+          </w:tcPr>
+          <w:p>
+            <w:pPr>
+              <w:spacing w:after="0" w:line="252"/>
+            </w:pPr>
+            <w:r>
+              <w:rPr>
+                <w:sz w:val="20"/>
+                <w:szCs w:val="20"/>
+              </w:rPr>
+              <w:t xml:space="preserve">pnpm workspaces</w:t>
+            </w:r>
+          </w:p>
+        </w:tc>
+        <w:tc>
+          <w:tcPr>
+            <w:tcW w:type="dxa" w:w="5460"/>
+            <w:shd w:fill="F2F6FB" w:val="clear"/>
             <w:tcMar>
               <w:top w:type="dxa" w:w="70"/>
               <w:left w:type="dxa" w:w="120"/>
@@ -7855,7 +7929,7 @@
         <w:t xml:space="preserve">AI_AGENT_INTENT_PROVIDER</w:t>
       </w:r>
       <w:r>
-        <w:t xml:space="preserve"> (either </w:t>
+        <w:t xml:space="preserve">. It accepts </w:t>
       </w:r>
       <w:r>
         <w:rPr>
@@ -7867,7 +7941,7 @@
         <w:t xml:space="preserve">rules</w:t>
       </w:r>
       <w:r>
-        <w:t xml:space="preserve"> or </w:t>
+        <w:t xml:space="preserve">, </w:t>
       </w:r>
       <w:r>
         <w:rPr>
@@ -7879,7 +7953,31 @@
         <w:t xml:space="preserve">gemini</w:t>
       </w:r>
       <w:r>
-        <w:t xml:space="preserve">). This is the “AI agent config” toggle covered in Part 11.</w:t>
+        <w:t xml:space="preserve">, </w:t>
+      </w:r>
+      <w:r>
+        <w:rPr>
+          <w:rFonts w:ascii="Consolas" w:cs="Consolas" w:eastAsia="Consolas" w:hAnsi="Consolas"/>
+          <w:color w:val="B91C1C"/>
+          <w:sz w:val="19"/>
+          <w:szCs w:val="19"/>
+        </w:rPr>
+        <w:t xml:space="preserve">openrouter</w:t>
+      </w:r>
+      <w:r>
+        <w:t xml:space="preserve">, or </w:t>
+      </w:r>
+      <w:r>
+        <w:rPr>
+          <w:rFonts w:ascii="Consolas" w:cs="Consolas" w:eastAsia="Consolas" w:hAnsi="Consolas"/>
+          <w:color w:val="B91C1C"/>
+          <w:sz w:val="19"/>
+          <w:szCs w:val="19"/>
+        </w:rPr>
+        <w:t xml:space="preserve">groq</w:t>
+      </w:r>
+      <w:r>
+        <w:t xml:space="preserve"> — so the classifier can be powered by Gemini or by an OpenAI-compatible model such as Groq. This is the “AI agent config” toggle covered in Part 11.</w:t>
       </w:r>
     </w:p>
     <w:p>
@@ -10233,7 +10331,7 @@
                 <w:sz w:val="20"/>
                 <w:szCs w:val="20"/>
               </w:rPr>
-              <w:t xml:space="preserve">Which classifier runs: 'rules' or 'gemini'</w:t>
+              <w:t xml:space="preserve">Classifier: rules / gemini / openrouter / groq</w:t>
             </w:r>
           </w:p>
         </w:tc>
@@ -10259,7 +10357,7 @@
                 <w:sz w:val="20"/>
                 <w:szCs w:val="20"/>
               </w:rPr>
-              <w:t xml:space="preserve">GEMINI_API_KEY</w:t>
+              <w:t xml:space="preserve">AI_AGENT_LLM_PROVIDER_ORDER</w:t>
             </w:r>
           </w:p>
         </w:tc>
@@ -10283,7 +10381,7 @@
                 <w:sz w:val="20"/>
                 <w:szCs w:val="20"/>
               </w:rPr>
-              <w:t xml:space="preserve">(none)</w:t>
+              <w:t xml:space="preserve">GEMINI</w:t>
             </w:r>
           </w:p>
         </w:tc>
@@ -10307,7 +10405,7 @@
                 <w:sz w:val="20"/>
                 <w:szCs w:val="20"/>
               </w:rPr>
-              <w:t xml:space="preserve">Key for Gemini. Without it, everything falls back to rules</w:t>
+              <w:t xml:space="preserve">Priority order of LLM providers to try, e.g. GEMINI,GROQ</w:t>
             </w:r>
           </w:p>
         </w:tc>
@@ -10333,7 +10431,7 @@
                 <w:sz w:val="20"/>
                 <w:szCs w:val="20"/>
               </w:rPr>
-              <w:t xml:space="preserve">GEMINI_MODEL</w:t>
+              <w:t xml:space="preserve">GEMINI_API_KEY</w:t>
             </w:r>
           </w:p>
         </w:tc>
@@ -10357,7 +10455,7 @@
                 <w:sz w:val="20"/>
                 <w:szCs w:val="20"/>
               </w:rPr>
-              <w:t xml:space="preserve">gemini-2.5-flash-lite</w:t>
+              <w:t xml:space="preserve">(none)</w:t>
             </w:r>
           </w:p>
         </w:tc>
@@ -10381,7 +10479,7 @@
                 <w:sz w:val="20"/>
                 <w:szCs w:val="20"/>
               </w:rPr>
-              <w:t xml:space="preserve">Which Gemini model to call</w:t>
+              <w:t xml:space="preserve">Key for Gemini (primary). Missing keys are skipped, not fatal</w:t>
             </w:r>
           </w:p>
         </w:tc>
@@ -10407,7 +10505,7 @@
                 <w:sz w:val="20"/>
                 <w:szCs w:val="20"/>
               </w:rPr>
-              <w:t xml:space="preserve">GEMINI_THINKING_LEVEL</w:t>
+              <w:t xml:space="preserve">GEMINI_MODEL</w:t>
             </w:r>
           </w:p>
         </w:tc>
@@ -10431,7 +10529,7 @@
                 <w:sz w:val="20"/>
                 <w:szCs w:val="20"/>
               </w:rPr>
-              <w:t xml:space="preserve">medium</w:t>
+              <w:t xml:space="preserve">gemini-2.5-flash</w:t>
             </w:r>
           </w:p>
         </w:tc>
@@ -10455,7 +10553,7 @@
                 <w:sz w:val="20"/>
                 <w:szCs w:val="20"/>
               </w:rPr>
-              <w:t xml:space="preserve">Reasoning depth: low / medium / high</w:t>
+              <w:t xml:space="preserve">Which Gemini model to call</w:t>
             </w:r>
           </w:p>
         </w:tc>
@@ -10481,7 +10579,7 @@
                 <w:sz w:val="20"/>
                 <w:szCs w:val="20"/>
               </w:rPr>
-              <w:t xml:space="preserve">AI_AGENT_INTENT_TIMEOUT_MS</w:t>
+              <w:t xml:space="preserve">GROQ_API_KEY</w:t>
             </w:r>
           </w:p>
         </w:tc>
@@ -10505,7 +10603,7 @@
                 <w:sz w:val="20"/>
                 <w:szCs w:val="20"/>
               </w:rPr>
-              <w:t xml:space="preserve">3000</w:t>
+              <w:t xml:space="preserve">(none)</w:t>
             </w:r>
           </w:p>
         </w:tc>
@@ -10529,7 +10627,7 @@
                 <w:sz w:val="20"/>
                 <w:szCs w:val="20"/>
               </w:rPr>
-              <w:t xml:space="preserve">How long to wait for the classifier before fallback</w:t>
+              <w:t xml:space="preserve">Enables Groq as an LLM provider</w:t>
             </w:r>
           </w:p>
         </w:tc>
@@ -10555,7 +10653,7 @@
                 <w:sz w:val="20"/>
                 <w:szCs w:val="20"/>
               </w:rPr>
-              <w:t xml:space="preserve">..._INTENT_CONFIDENCE_THRESHOLD</w:t>
+              <w:t xml:space="preserve">GROQ_MODEL</w:t>
             </w:r>
           </w:p>
         </w:tc>
@@ -10579,7 +10677,7 @@
                 <w:sz w:val="20"/>
                 <w:szCs w:val="20"/>
               </w:rPr>
-              <w:t xml:space="preserve">0.4</w:t>
+              <w:t xml:space="preserve">llama-3.1-8b-instant</w:t>
             </w:r>
           </w:p>
         </w:tc>
@@ -10603,7 +10701,7 @@
                 <w:sz w:val="20"/>
                 <w:szCs w:val="20"/>
               </w:rPr>
-              <w:t xml:space="preserve">Below this, the supervisor asks for clarification</w:t>
+              <w:t xml:space="preserve">Which Groq model to call</w:t>
             </w:r>
           </w:p>
         </w:tc>
@@ -10629,7 +10727,7 @@
                 <w:sz w:val="20"/>
                 <w:szCs w:val="20"/>
               </w:rPr>
-              <w:t xml:space="preserve">..._SCOPE_OVERRIDE_THRESHOLD</w:t>
+              <w:t xml:space="preserve">OPENROUTER_API_KEY / MODEL</w:t>
             </w:r>
           </w:p>
         </w:tc>
@@ -10653,7 +10751,7 @@
                 <w:sz w:val="20"/>
                 <w:szCs w:val="20"/>
               </w:rPr>
-              <w:t xml:space="preserve">0.7</w:t>
+              <w:t xml:space="preserve">(none) / openrouter/auto</w:t>
             </w:r>
           </w:p>
         </w:tc>
@@ -10677,7 +10775,7 @@
                 <w:sz w:val="20"/>
                 <w:szCs w:val="20"/>
               </w:rPr>
-              <w:t xml:space="preserve">Min Gemini confidence to override an OUT_OF_SCOPE gate</w:t>
+              <w:t xml:space="preserve">Enables OpenRouter as a fallback provider</w:t>
             </w:r>
           </w:p>
         </w:tc>
@@ -10703,7 +10801,7 @@
                 <w:sz w:val="20"/>
                 <w:szCs w:val="20"/>
               </w:rPr>
-              <w:t xml:space="preserve">..._DOWNSTREAM_TIMEOUT_MS</w:t>
+              <w:t xml:space="preserve">XAI_API_KEY / MODEL</w:t>
             </w:r>
           </w:p>
         </w:tc>
@@ -10727,7 +10825,7 @@
                 <w:sz w:val="20"/>
                 <w:szCs w:val="20"/>
               </w:rPr>
-              <w:t xml:space="preserve">8000</w:t>
+              <w:t xml:space="preserve">(none) / grok-2-latest</w:t>
             </w:r>
           </w:p>
         </w:tc>
@@ -10751,7 +10849,7 @@
                 <w:sz w:val="20"/>
                 <w:szCs w:val="20"/>
               </w:rPr>
-              <w:t xml:space="preserve">Timeout for each call to HR Core / Social</w:t>
+              <w:t xml:space="preserve">Enables xAI Grok as a fallback provider</w:t>
             </w:r>
           </w:p>
         </w:tc>
@@ -10777,7 +10875,7 @@
                 <w:sz w:val="20"/>
                 <w:szCs w:val="20"/>
               </w:rPr>
-              <w:t xml:space="preserve">HR_CORE_URL / SOCIAL_URL</w:t>
+              <w:t xml:space="preserve">..._INTENT_CONFIDENCE_THRESHOLD</w:t>
             </w:r>
           </w:p>
         </w:tc>
@@ -10801,7 +10899,7 @@
                 <w:sz w:val="20"/>
                 <w:szCs w:val="20"/>
               </w:rPr>
-              <w:t xml:space="preserve">localhost</w:t>
+              <w:t xml:space="preserve">0.4</w:t>
             </w:r>
           </w:p>
         </w:tc>
@@ -10825,7 +10923,155 @@
                 <w:sz w:val="20"/>
                 <w:szCs w:val="20"/>
               </w:rPr>
-              <w:t xml:space="preserve">Where to reach the other services</w:t>
+              <w:t xml:space="preserve">Below this, the supervisor asks for clarification</w:t>
+            </w:r>
+          </w:p>
+        </w:tc>
+      </w:tr>
+      <w:tr>
+        <w:tc>
+          <w:tcPr>
+            <w:tcW w:type="dxa" w:w="3700"/>
+            <w:shd w:fill="F2F6FB" w:val="clear"/>
+            <w:tcMar>
+              <w:top w:type="dxa" w:w="70"/>
+              <w:left w:type="dxa" w:w="120"/>
+              <w:bottom w:type="dxa" w:w="70"/>
+              <w:right w:type="dxa" w:w="120"/>
+            </w:tcMar>
+          </w:tcPr>
+          <w:p>
+            <w:pPr>
+              <w:spacing w:after="0" w:line="252"/>
+            </w:pPr>
+            <w:r>
+              <w:rPr>
+                <w:sz w:val="20"/>
+                <w:szCs w:val="20"/>
+              </w:rPr>
+              <w:t xml:space="preserve">..._SCOPE_OVERRIDE_THRESHOLD</w:t>
+            </w:r>
+          </w:p>
+        </w:tc>
+        <w:tc>
+          <w:tcPr>
+            <w:tcW w:type="dxa" w:w="2100"/>
+            <w:shd w:fill="F2F6FB" w:val="clear"/>
+            <w:tcMar>
+              <w:top w:type="dxa" w:w="70"/>
+              <w:left w:type="dxa" w:w="120"/>
+              <w:bottom w:type="dxa" w:w="70"/>
+              <w:right w:type="dxa" w:w="120"/>
+            </w:tcMar>
+          </w:tcPr>
+          <w:p>
+            <w:pPr>
+              <w:spacing w:after="0" w:line="252"/>
+            </w:pPr>
+            <w:r>
+              <w:rPr>
+                <w:sz w:val="20"/>
+                <w:szCs w:val="20"/>
+              </w:rPr>
+              <w:t xml:space="preserve">0.7</w:t>
+            </w:r>
+          </w:p>
+        </w:tc>
+        <w:tc>
+          <w:tcPr>
+            <w:tcW w:type="dxa" w:w="3560"/>
+            <w:shd w:fill="F2F6FB" w:val="clear"/>
+            <w:tcMar>
+              <w:top w:type="dxa" w:w="70"/>
+              <w:left w:type="dxa" w:w="120"/>
+              <w:bottom w:type="dxa" w:w="70"/>
+              <w:right w:type="dxa" w:w="120"/>
+            </w:tcMar>
+          </w:tcPr>
+          <w:p>
+            <w:pPr>
+              <w:spacing w:after="0" w:line="252"/>
+            </w:pPr>
+            <w:r>
+              <w:rPr>
+                <w:sz w:val="20"/>
+                <w:szCs w:val="20"/>
+              </w:rPr>
+              <w:t xml:space="preserve">Min confidence to override an OUT_OF_SCOPE gate</w:t>
+            </w:r>
+          </w:p>
+        </w:tc>
+      </w:tr>
+      <w:tr>
+        <w:tc>
+          <w:tcPr>
+            <w:tcW w:type="dxa" w:w="3700"/>
+            <w:shd w:fill="FFFFFF" w:val="clear"/>
+            <w:tcMar>
+              <w:top w:type="dxa" w:w="70"/>
+              <w:left w:type="dxa" w:w="120"/>
+              <w:bottom w:type="dxa" w:w="70"/>
+              <w:right w:type="dxa" w:w="120"/>
+            </w:tcMar>
+          </w:tcPr>
+          <w:p>
+            <w:pPr>
+              <w:spacing w:after="0" w:line="252"/>
+            </w:pPr>
+            <w:r>
+              <w:rPr>
+                <w:sz w:val="20"/>
+                <w:szCs w:val="20"/>
+              </w:rPr>
+              <w:t xml:space="preserve">..._DOWNSTREAM_TIMEOUT_MS</w:t>
+            </w:r>
+          </w:p>
+        </w:tc>
+        <w:tc>
+          <w:tcPr>
+            <w:tcW w:type="dxa" w:w="2100"/>
+            <w:shd w:fill="FFFFFF" w:val="clear"/>
+            <w:tcMar>
+              <w:top w:type="dxa" w:w="70"/>
+              <w:left w:type="dxa" w:w="120"/>
+              <w:bottom w:type="dxa" w:w="70"/>
+              <w:right w:type="dxa" w:w="120"/>
+            </w:tcMar>
+          </w:tcPr>
+          <w:p>
+            <w:pPr>
+              <w:spacing w:after="0" w:line="252"/>
+            </w:pPr>
+            <w:r>
+              <w:rPr>
+                <w:sz w:val="20"/>
+                <w:szCs w:val="20"/>
+              </w:rPr>
+              <w:t xml:space="preserve">8000</w:t>
+            </w:r>
+          </w:p>
+        </w:tc>
+        <w:tc>
+          <w:tcPr>
+            <w:tcW w:type="dxa" w:w="3560"/>
+            <w:shd w:fill="FFFFFF" w:val="clear"/>
+            <w:tcMar>
+              <w:top w:type="dxa" w:w="70"/>
+              <w:left w:type="dxa" w:w="120"/>
+              <w:bottom w:type="dxa" w:w="70"/>
+              <w:right w:type="dxa" w:w="120"/>
+            </w:tcMar>
+          </w:tcPr>
+          <w:p>
+            <w:pPr>
+              <w:spacing w:after="0" w:line="252"/>
+            </w:pPr>
+            <w:r>
+              <w:rPr>
+                <w:sz w:val="20"/>
+                <w:szCs w:val="20"/>
+              </w:rPr>
+              <w:t xml:space="preserve">Timeout for each call to HR Core / Social</w:t>
             </w:r>
           </w:p>
         </w:tc>
@@ -14032,10 +14278,10 @@
           <w:sz w:val="19"/>
           <w:szCs w:val="19"/>
         </w:rPr>
-        <w:t xml:space="preserve">GeminiToolCallerService</w:t>
-      </w:r>
-      <w:r>
-        <w:t xml:space="preserve">.</w:t>
+        <w:t xml:space="preserve">LlmFallbackOrchestratorService</w:t>
+      </w:r>
+      <w:r>
+        <w:t xml:space="preserve"> (which picks an LLM provider — Gemini, Groq, etc. — see the next section).</w:t>
       </w:r>
     </w:p>
     <w:p>
@@ -14048,7 +14294,7 @@
         <w:spacing w:after="80" w:line="270"/>
       </w:pPr>
       <w:r>
-        <w:t xml:space="preserve">Gemini decides which tool(s) to call; the tool fetches real data from HR Core (carrying the user's token); Gemini reads the results and writes the answer.</w:t>
+        <w:t xml:space="preserve">The chosen LLM decides which tool(s) to call; the tool fetches real data from HR Core (carrying the user's token); the LLM reads the results and writes the answer.</w:t>
       </w:r>
     </w:p>
     <w:p>
@@ -14128,7 +14374,7 @@
                 <w:sz w:val="18"/>
                 <w:szCs w:val="18"/>
               </w:rPr>
-              <w:t xml:space="preserve">  if (this.geminiToolCaller &amp;&amp; this.toolRegistry) {</w:t>
+              <w:t xml:space="preserve">  if (this.llmCaller &amp;&amp; this.toolRegistry) {   // llmCaller = LLM orchestrator</w:t>
             </w:r>
           </w:p>
           <w:p>
@@ -14156,7 +14402,7 @@
                 <w:sz w:val="18"/>
                 <w:szCs w:val="18"/>
               </w:rPr>
-              <w:t xml:space="preserve">    const outcome = await this.geminiToolCaller.call(</w:t>
+              <w:t xml:space="preserve">    const outcome = await this.llmCaller.call(</w:t>
             </w:r>
           </w:p>
           <w:p>
@@ -14240,7 +14486,7 @@
                 <w:sz w:val="18"/>
                 <w:szCs w:val="18"/>
               </w:rPr>
-              <w:t xml:space="preserve">  // Fallback: no Gemini -&gt; call HR Core directly and format a summary</w:t>
+              <w:t xml:space="preserve">  // Fallback: no LLM -&gt; call HR Core directly and format a summary</w:t>
             </w:r>
           </w:p>
           <w:p>
@@ -16147,6 +16393,1013 @@
         <w:pStyle w:val="Heading2"/>
       </w:pPr>
       <w:r>
+        <w:t xml:space="preserve">Recent update — one brain, many providers (Gemini, Groq, and more)</w:t>
+      </w:r>
+    </w:p>
+    <w:p>
+      <w:pPr>
+        <w:spacing w:after="140" w:line="276"/>
+      </w:pPr>
+      <w:r>
+        <w:t xml:space="preserve">A recent change made the AI module </w:t>
+      </w:r>
+      <w:r>
+        <w:rPr>
+          <w:b/>
+          <w:bCs/>
+        </w:rPr>
+        <w:t xml:space="preserve">provider-independent</w:t>
+      </w:r>
+      <w:r>
+        <w:t xml:space="preserve">. Specialists no longer call Gemini directly — they call a single new service, the </w:t>
+      </w:r>
+      <w:r>
+        <w:rPr>
+          <w:rFonts w:ascii="Consolas" w:cs="Consolas" w:eastAsia="Consolas" w:hAnsi="Consolas"/>
+          <w:color w:val="B91C1C"/>
+          <w:sz w:val="19"/>
+          <w:szCs w:val="19"/>
+        </w:rPr>
+        <w:t xml:space="preserve">LlmFallbackOrchestratorService</w:t>
+      </w:r>
+      <w:r>
+        <w:t xml:space="preserve">, which decides </w:t>
+      </w:r>
+      <w:r>
+        <w:rPr>
+          <w:b/>
+          <w:bCs/>
+        </w:rPr>
+        <w:t xml:space="preserve">which</w:t>
+      </w:r>
+      <w:r>
+        <w:t xml:space="preserve"> large language model actually runs. Gemini stays the primary, but if it's unconfigured, rate-limited, or down, the request automatically fails over to a back-up provider. </w:t>
+      </w:r>
+      <w:r>
+        <w:rPr>
+          <w:b/>
+          <w:bCs/>
+        </w:rPr>
+        <w:t xml:space="preserve">Groq</w:t>
+      </w:r>
+      <w:r>
+        <w:t xml:space="preserve"> is one of those back-ups.</w:t>
+      </w:r>
+    </w:p>
+    <w:p>
+      <w:pPr>
+        <w:spacing w:after="140" w:line="276"/>
+      </w:pPr>
+      <w:r>
+        <w:t xml:space="preserve">The orchestrator reads an ordered list from </w:t>
+      </w:r>
+      <w:r>
+        <w:rPr>
+          <w:rFonts w:ascii="Consolas" w:cs="Consolas" w:eastAsia="Consolas" w:hAnsi="Consolas"/>
+          <w:color w:val="B91C1C"/>
+          <w:sz w:val="19"/>
+          <w:szCs w:val="19"/>
+        </w:rPr>
+        <w:t xml:space="preserve">AI_AGENT_LLM_PROVIDER_ORDER</w:t>
+      </w:r>
+      <w:r>
+        <w:t xml:space="preserve"> (default just </w:t>
+      </w:r>
+      <w:r>
+        <w:rPr>
+          <w:rFonts w:ascii="Consolas" w:cs="Consolas" w:eastAsia="Consolas" w:hAnsi="Consolas"/>
+          <w:color w:val="B91C1C"/>
+          <w:sz w:val="19"/>
+          <w:szCs w:val="19"/>
+        </w:rPr>
+        <w:t xml:space="preserve">GEMINI</w:t>
+      </w:r>
+      <w:r>
+        <w:t xml:space="preserve">; you could set </w:t>
+      </w:r>
+      <w:r>
+        <w:rPr>
+          <w:rFonts w:ascii="Consolas" w:cs="Consolas" w:eastAsia="Consolas" w:hAnsi="Consolas"/>
+          <w:color w:val="B91C1C"/>
+          <w:sz w:val="19"/>
+          <w:szCs w:val="19"/>
+        </w:rPr>
+        <w:t xml:space="preserve">GEMINI,GROQ</w:t>
+      </w:r>
+      <w:r>
+        <w:t xml:space="preserve">) and tries each provider in turn, skipping any that isn't configured:</w:t>
+      </w:r>
+    </w:p>
+    <w:tbl>
+      <w:tblPr>
+        <w:tblW w:type="dxa" w:w="9360"/>
+        <w:tblBorders>
+          <w:top w:val="single" w:color="D1D5DB" w:sz="4"/>
+          <w:left w:val="single" w:color="2E75B6" w:sz="12"/>
+          <w:bottom w:val="single" w:color="D1D5DB" w:sz="4"/>
+          <w:right w:val="single" w:color="D1D5DB" w:sz="4"/>
+          <w:insideH w:val="none"/>
+          <w:insideV w:val="none"/>
+        </w:tblBorders>
+      </w:tblPr>
+      <w:tblGrid>
+        <w:gridCol w:w="9360"/>
+      </w:tblGrid>
+      <w:tr>
+        <w:tc>
+          <w:tcPr>
+            <w:tcW w:type="dxa" w:w="9360"/>
+            <w:shd w:fill="F3F4F6" w:val="clear"/>
+            <w:tcMar>
+              <w:top w:type="dxa" w:w="100"/>
+              <w:left w:type="dxa" w:w="160"/>
+              <w:bottom w:type="dxa" w:w="100"/>
+              <w:right w:type="dxa" w:w="120"/>
+            </w:tcMar>
+          </w:tcPr>
+          <w:p>
+            <w:pPr>
+              <w:spacing w:after="0" w:line="250"/>
+            </w:pPr>
+            <w:r>
+              <w:rPr>
+                <w:rFonts w:ascii="Consolas" w:cs="Consolas" w:eastAsia="Consolas" w:hAnsi="Consolas"/>
+                <w:color w:val="1F2937"/>
+                <w:sz w:val="18"/>
+                <w:szCs w:val="18"/>
+              </w:rPr>
+              <w:t xml:space="preserve">for (const provider of this.providers) {</w:t>
+            </w:r>
+          </w:p>
+          <w:p>
+            <w:pPr>
+              <w:spacing w:after="0" w:line="250"/>
+            </w:pPr>
+            <w:r>
+              <w:rPr>
+                <w:rFonts w:ascii="Consolas" w:cs="Consolas" w:eastAsia="Consolas" w:hAnsi="Consolas"/>
+                <w:color w:val="1F2937"/>
+                <w:sz w:val="18"/>
+                <w:szCs w:val="18"/>
+              </w:rPr>
+              <w:t xml:space="preserve">  if (!provider.isConfigured()) continue;         // no API key? skip it</w:t>
+            </w:r>
+          </w:p>
+          <w:p>
+            <w:pPr>
+              <w:spacing w:after="0" w:line="250"/>
+            </w:pPr>
+            <w:r>
+              <w:rPr>
+                <w:rFonts w:ascii="Consolas" w:cs="Consolas" w:eastAsia="Consolas" w:hAnsi="Consolas"/>
+                <w:color w:val="1F2937"/>
+                <w:sz w:val="18"/>
+                <w:szCs w:val="18"/>
+              </w:rPr>
+              <w:t xml:space="preserve">  const outcome = await provider.call(prompt, msg, tools, history, options);</w:t>
+            </w:r>
+          </w:p>
+          <w:p>
+            <w:pPr>
+              <w:spacing w:after="0" w:line="250"/>
+            </w:pPr>
+            <w:r>
+              <w:rPr>
+                <w:rFonts w:ascii="Consolas" w:cs="Consolas" w:eastAsia="Consolas" w:hAnsi="Consolas"/>
+                <w:color w:val="1F2937"/>
+                <w:sz w:val="18"/>
+                <w:szCs w:val="18"/>
+              </w:rPr>
+              <w:t xml:space="preserve">  if (outcome === null) continue;                 // infra failure -&gt; next provider</w:t>
+            </w:r>
+          </w:p>
+          <w:p>
+            <w:pPr>
+              <w:spacing w:after="0" w:line="250"/>
+            </w:pPr>
+            <w:r>
+              <w:rPr>
+                <w:rFonts w:ascii="Consolas" w:cs="Consolas" w:eastAsia="Consolas" w:hAnsi="Consolas"/>
+                <w:color w:val="1F2937"/>
+                <w:sz w:val="18"/>
+                <w:szCs w:val="18"/>
+              </w:rPr>
+              <w:t xml:space="preserve">  return { ...outcome, usedFallbackProvider };     // got an answer -&gt; done</w:t>
+            </w:r>
+          </w:p>
+          <w:p>
+            <w:pPr>
+              <w:spacing w:after="0" w:line="250"/>
+            </w:pPr>
+            <w:r>
+              <w:rPr>
+                <w:rFonts w:ascii="Consolas" w:cs="Consolas" w:eastAsia="Consolas" w:hAnsi="Consolas"/>
+                <w:color w:val="1F2937"/>
+                <w:sz w:val="18"/>
+                <w:szCs w:val="18"/>
+              </w:rPr>
+              <w:t xml:space="preserve">}</w:t>
+            </w:r>
+          </w:p>
+          <w:p>
+            <w:pPr>
+              <w:spacing w:after="0" w:line="250"/>
+            </w:pPr>
+            <w:r>
+              <w:rPr>
+                <w:rFonts w:ascii="Consolas" w:cs="Consolas" w:eastAsia="Consolas" w:hAnsi="Consolas"/>
+                <w:color w:val="1F2937"/>
+                <w:sz w:val="18"/>
+                <w:szCs w:val="18"/>
+              </w:rPr>
+              <w:t xml:space="preserve">return null;</w:t>
+            </w:r>
+          </w:p>
+        </w:tc>
+      </w:tr>
+    </w:tbl>
+    <w:tbl>
+      <w:tblPr>
+        <w:tblW w:type="dxa" w:w="9360"/>
+        <w:tblBorders>
+          <w:top w:val="single" w:color="D7E3F4" w:sz="4"/>
+          <w:left w:val="single" w:color="2E75B6" w:sz="16"/>
+          <w:bottom w:val="single" w:color="D7E3F4" w:sz="4"/>
+          <w:right w:val="single" w:color="D7E3F4" w:sz="4"/>
+          <w:insideH w:val="none"/>
+          <w:insideV w:val="none"/>
+        </w:tblBorders>
+      </w:tblPr>
+      <w:tblGrid>
+        <w:gridCol w:w="9360"/>
+      </w:tblGrid>
+      <w:tr>
+        <w:tc>
+          <w:tcPr>
+            <w:tcW w:type="dxa" w:w="9360"/>
+            <w:shd w:fill="FDECEA" w:val="clear"/>
+            <w:tcMar>
+              <w:top w:type="dxa" w:w="120"/>
+              <w:left w:type="dxa" w:w="160"/>
+              <w:bottom w:type="dxa" w:w="120"/>
+              <w:right w:type="dxa" w:w="160"/>
+            </w:tcMar>
+          </w:tcPr>
+          <w:p>
+            <w:pPr>
+              <w:spacing w:after="60"/>
+            </w:pPr>
+            <w:r>
+              <w:rPr>
+                <w:b/>
+                <w:bCs/>
+                <w:color w:val="1F4E79"/>
+                <w:sz w:val="21"/>
+                <w:szCs w:val="21"/>
+              </w:rPr>
+              <w:t xml:space="preserve">The critical fail-over rule</w:t>
+            </w:r>
+          </w:p>
+          <w:p>
+            <w:pPr>
+              <w:spacing w:after="60" w:line="270"/>
+            </w:pPr>
+            <w:r>
+              <w:t xml:space="preserve">A provider is only skipped when it returns null — meaning an infrastructure failure (down, timed out, rate-limited, unconfigured). A produced answer is never overridden, and that includes refusals and guardrail blocks. If Gemini deliberately refuses an unsafe request, the orchestrator returns that refusal — it does NOT 'shop around' for a more permissive model. Safety decisions are final.</w:t>
+            </w:r>
+          </w:p>
+        </w:tc>
+      </w:tr>
+    </w:tbl>
+    <w:p>
+      <w:pPr>
+        <w:spacing w:after="140" w:line="276"/>
+      </w:pPr>
+      <w:r>
+        <w:t xml:space="preserve">Each provider runs its </w:t>
+      </w:r>
+      <w:r>
+        <w:rPr>
+          <w:b/>
+          <w:bCs/>
+        </w:rPr>
+        <w:t xml:space="preserve">own complete tool-calling loop from the original input</w:t>
+      </w:r>
+      <w:r>
+        <w:t xml:space="preserve"> — there is no mid-loop handoff where one model half-answers and another finishes. If Gemini fails on round 3, Groq starts fresh from the user's message and its own round 1.</w:t>
+      </w:r>
+    </w:p>
+    <w:p>
+      <w:pPr>
+        <w:pStyle w:val="Heading3"/>
+      </w:pPr>
+      <w:r>
+        <w:t xml:space="preserve">Why Groq needs almost no new code: the OpenAI-compatible adapter</w:t>
+      </w:r>
+    </w:p>
+    <w:p>
+      <w:pPr>
+        <w:spacing w:after="140" w:line="276"/>
+      </w:pPr>
+      <w:r>
+        <w:t xml:space="preserve">Groq, OpenRouter, and xAI (Grok) all expose the </w:t>
+      </w:r>
+      <w:r>
+        <w:rPr>
+          <w:b/>
+          <w:bCs/>
+        </w:rPr>
+        <w:t xml:space="preserve">same</w:t>
+      </w:r>
+      <w:r>
+        <w:t xml:space="preserve"> API shape — the OpenAI “chat completions” format with </w:t>
+      </w:r>
+      <w:r>
+        <w:rPr>
+          <w:rFonts w:ascii="Consolas" w:cs="Consolas" w:eastAsia="Consolas" w:hAnsi="Consolas"/>
+          <w:color w:val="B91C1C"/>
+          <w:sz w:val="19"/>
+          <w:szCs w:val="19"/>
+        </w:rPr>
+        <w:t xml:space="preserve">tool_calls</w:t>
+      </w:r>
+      <w:r>
+        <w:t xml:space="preserve"> and </w:t>
+      </w:r>
+      <w:r>
+        <w:rPr>
+          <w:rFonts w:ascii="Consolas" w:cs="Consolas" w:eastAsia="Consolas" w:hAnsi="Consolas"/>
+          <w:color w:val="B91C1C"/>
+          <w:sz w:val="19"/>
+          <w:szCs w:val="19"/>
+        </w:rPr>
+        <w:t xml:space="preserve">tool_call_id</w:t>
+      </w:r>
+      <w:r>
+        <w:t xml:space="preserve">. So instead of three separate integrations, there is </w:t>
+      </w:r>
+      <w:r>
+        <w:rPr>
+          <w:b/>
+          <w:bCs/>
+        </w:rPr>
+        <w:t xml:space="preserve">one</w:t>
+      </w:r>
+      <w:r>
+        <w:t xml:space="preserve"> parameterized adapter class, </w:t>
+      </w:r>
+      <w:r>
+        <w:rPr>
+          <w:rFonts w:ascii="Consolas" w:cs="Consolas" w:eastAsia="Consolas" w:hAnsi="Consolas"/>
+          <w:color w:val="B91C1C"/>
+          <w:sz w:val="19"/>
+          <w:szCs w:val="19"/>
+        </w:rPr>
+        <w:t xml:space="preserve">OpenAiCompatibleToolCallerService</w:t>
+      </w:r>
+      <w:r>
+        <w:t xml:space="preserve">, registered three times (once per provider) with only the base URL, key, and model differing:</w:t>
+      </w:r>
+    </w:p>
+    <w:tbl>
+      <w:tblPr>
+        <w:tblW w:type="dxa" w:w="9360"/>
+        <w:tblBorders>
+          <w:top w:val="single" w:color="BFCEE0" w:sz="2"/>
+          <w:left w:val="single" w:color="BFCEE0" w:sz="2"/>
+          <w:bottom w:val="single" w:color="BFCEE0" w:sz="2"/>
+          <w:right w:val="single" w:color="BFCEE0" w:sz="2"/>
+          <w:insideH w:val="single" w:color="BFCEE0" w:sz="2"/>
+          <w:insideV w:val="single" w:color="BFCEE0" w:sz="2"/>
+        </w:tblBorders>
+      </w:tblPr>
+      <w:tblGrid>
+        <w:gridCol w:w="2100"/>
+        <w:gridCol w:w="4360"/>
+        <w:gridCol w:w="2900"/>
+      </w:tblGrid>
+      <w:tr>
+        <w:trPr>
+          <w:tblHeader/>
+        </w:trPr>
+        <w:tc>
+          <w:tcPr>
+            <w:tcW w:type="dxa" w:w="2100"/>
+            <w:shd w:fill="1F4E79" w:val="clear"/>
+            <w:tcMar>
+              <w:top w:type="dxa" w:w="80"/>
+              <w:left w:type="dxa" w:w="120"/>
+              <w:bottom w:type="dxa" w:w="80"/>
+              <w:right w:type="dxa" w:w="120"/>
+            </w:tcMar>
+          </w:tcPr>
+          <w:p>
+            <w:r>
+              <w:rPr>
+                <w:b/>
+                <w:bCs/>
+                <w:color w:val="FFFFFF"/>
+                <w:sz w:val="20"/>
+                <w:szCs w:val="20"/>
+              </w:rPr>
+              <w:t xml:space="preserve">Provider</w:t>
+            </w:r>
+          </w:p>
+        </w:tc>
+        <w:tc>
+          <w:tcPr>
+            <w:tcW w:type="dxa" w:w="4360"/>
+            <w:shd w:fill="1F4E79" w:val="clear"/>
+            <w:tcMar>
+              <w:top w:type="dxa" w:w="80"/>
+              <w:left w:type="dxa" w:w="120"/>
+              <w:bottom w:type="dxa" w:w="80"/>
+              <w:right w:type="dxa" w:w="120"/>
+            </w:tcMar>
+          </w:tcPr>
+          <w:p>
+            <w:r>
+              <w:rPr>
+                <w:b/>
+                <w:bCs/>
+                <w:color w:val="FFFFFF"/>
+                <w:sz w:val="20"/>
+                <w:szCs w:val="20"/>
+              </w:rPr>
+              <w:t xml:space="preserve">Default base URL</w:t>
+            </w:r>
+          </w:p>
+        </w:tc>
+        <w:tc>
+          <w:tcPr>
+            <w:tcW w:type="dxa" w:w="2900"/>
+            <w:shd w:fill="1F4E79" w:val="clear"/>
+            <w:tcMar>
+              <w:top w:type="dxa" w:w="80"/>
+              <w:left w:type="dxa" w:w="120"/>
+              <w:bottom w:type="dxa" w:w="80"/>
+              <w:right w:type="dxa" w:w="120"/>
+            </w:tcMar>
+          </w:tcPr>
+          <w:p>
+            <w:r>
+              <w:rPr>
+                <w:b/>
+                <w:bCs/>
+                <w:color w:val="FFFFFF"/>
+                <w:sz w:val="20"/>
+                <w:szCs w:val="20"/>
+              </w:rPr>
+              <w:t xml:space="preserve">Default model</w:t>
+            </w:r>
+          </w:p>
+        </w:tc>
+      </w:tr>
+      <w:tr>
+        <w:tc>
+          <w:tcPr>
+            <w:tcW w:type="dxa" w:w="2100"/>
+            <w:shd w:fill="FFFFFF" w:val="clear"/>
+            <w:tcMar>
+              <w:top w:type="dxa" w:w="70"/>
+              <w:left w:type="dxa" w:w="120"/>
+              <w:bottom w:type="dxa" w:w="70"/>
+              <w:right w:type="dxa" w:w="120"/>
+            </w:tcMar>
+          </w:tcPr>
+          <w:p>
+            <w:pPr>
+              <w:spacing w:after="0" w:line="252"/>
+            </w:pPr>
+            <w:r>
+              <w:rPr>
+                <w:sz w:val="20"/>
+                <w:szCs w:val="20"/>
+              </w:rPr>
+              <w:t xml:space="preserve">Groq</w:t>
+            </w:r>
+          </w:p>
+        </w:tc>
+        <w:tc>
+          <w:tcPr>
+            <w:tcW w:type="dxa" w:w="4360"/>
+            <w:shd w:fill="FFFFFF" w:val="clear"/>
+            <w:tcMar>
+              <w:top w:type="dxa" w:w="70"/>
+              <w:left w:type="dxa" w:w="120"/>
+              <w:bottom w:type="dxa" w:w="70"/>
+              <w:right w:type="dxa" w:w="120"/>
+            </w:tcMar>
+          </w:tcPr>
+          <w:p>
+            <w:pPr>
+              <w:spacing w:after="0" w:line="252"/>
+            </w:pPr>
+            <w:r>
+              <w:rPr>
+                <w:sz w:val="20"/>
+                <w:szCs w:val="20"/>
+              </w:rPr>
+              <w:t xml:space="preserve">https://api.groq.com/openai/v1</w:t>
+            </w:r>
+          </w:p>
+        </w:tc>
+        <w:tc>
+          <w:tcPr>
+            <w:tcW w:type="dxa" w:w="2900"/>
+            <w:shd w:fill="FFFFFF" w:val="clear"/>
+            <w:tcMar>
+              <w:top w:type="dxa" w:w="70"/>
+              <w:left w:type="dxa" w:w="120"/>
+              <w:bottom w:type="dxa" w:w="70"/>
+              <w:right w:type="dxa" w:w="120"/>
+            </w:tcMar>
+          </w:tcPr>
+          <w:p>
+            <w:pPr>
+              <w:spacing w:after="0" w:line="252"/>
+            </w:pPr>
+            <w:r>
+              <w:rPr>
+                <w:sz w:val="20"/>
+                <w:szCs w:val="20"/>
+              </w:rPr>
+              <w:t xml:space="preserve">llama-3.1-8b-instant</w:t>
+            </w:r>
+          </w:p>
+        </w:tc>
+      </w:tr>
+      <w:tr>
+        <w:tc>
+          <w:tcPr>
+            <w:tcW w:type="dxa" w:w="2100"/>
+            <w:shd w:fill="F2F6FB" w:val="clear"/>
+            <w:tcMar>
+              <w:top w:type="dxa" w:w="70"/>
+              <w:left w:type="dxa" w:w="120"/>
+              <w:bottom w:type="dxa" w:w="70"/>
+              <w:right w:type="dxa" w:w="120"/>
+            </w:tcMar>
+          </w:tcPr>
+          <w:p>
+            <w:pPr>
+              <w:spacing w:after="0" w:line="252"/>
+            </w:pPr>
+            <w:r>
+              <w:rPr>
+                <w:sz w:val="20"/>
+                <w:szCs w:val="20"/>
+              </w:rPr>
+              <w:t xml:space="preserve">OpenRouter</w:t>
+            </w:r>
+          </w:p>
+        </w:tc>
+        <w:tc>
+          <w:tcPr>
+            <w:tcW w:type="dxa" w:w="4360"/>
+            <w:shd w:fill="F2F6FB" w:val="clear"/>
+            <w:tcMar>
+              <w:top w:type="dxa" w:w="70"/>
+              <w:left w:type="dxa" w:w="120"/>
+              <w:bottom w:type="dxa" w:w="70"/>
+              <w:right w:type="dxa" w:w="120"/>
+            </w:tcMar>
+          </w:tcPr>
+          <w:p>
+            <w:pPr>
+              <w:spacing w:after="0" w:line="252"/>
+            </w:pPr>
+            <w:r>
+              <w:rPr>
+                <w:sz w:val="20"/>
+                <w:szCs w:val="20"/>
+              </w:rPr>
+              <w:t xml:space="preserve">https://openrouter.ai/api/v1</w:t>
+            </w:r>
+          </w:p>
+        </w:tc>
+        <w:tc>
+          <w:tcPr>
+            <w:tcW w:type="dxa" w:w="2900"/>
+            <w:shd w:fill="F2F6FB" w:val="clear"/>
+            <w:tcMar>
+              <w:top w:type="dxa" w:w="70"/>
+              <w:left w:type="dxa" w:w="120"/>
+              <w:bottom w:type="dxa" w:w="70"/>
+              <w:right w:type="dxa" w:w="120"/>
+            </w:tcMar>
+          </w:tcPr>
+          <w:p>
+            <w:pPr>
+              <w:spacing w:after="0" w:line="252"/>
+            </w:pPr>
+            <w:r>
+              <w:rPr>
+                <w:sz w:val="20"/>
+                <w:szCs w:val="20"/>
+              </w:rPr>
+              <w:t xml:space="preserve">openrouter/auto</w:t>
+            </w:r>
+          </w:p>
+        </w:tc>
+      </w:tr>
+      <w:tr>
+        <w:tc>
+          <w:tcPr>
+            <w:tcW w:type="dxa" w:w="2100"/>
+            <w:shd w:fill="FFFFFF" w:val="clear"/>
+            <w:tcMar>
+              <w:top w:type="dxa" w:w="70"/>
+              <w:left w:type="dxa" w:w="120"/>
+              <w:bottom w:type="dxa" w:w="70"/>
+              <w:right w:type="dxa" w:w="120"/>
+            </w:tcMar>
+          </w:tcPr>
+          <w:p>
+            <w:pPr>
+              <w:spacing w:after="0" w:line="252"/>
+            </w:pPr>
+            <w:r>
+              <w:rPr>
+                <w:sz w:val="20"/>
+                <w:szCs w:val="20"/>
+              </w:rPr>
+              <w:t xml:space="preserve">xAI (Grok)</w:t>
+            </w:r>
+          </w:p>
+        </w:tc>
+        <w:tc>
+          <w:tcPr>
+            <w:tcW w:type="dxa" w:w="4360"/>
+            <w:shd w:fill="FFFFFF" w:val="clear"/>
+            <w:tcMar>
+              <w:top w:type="dxa" w:w="70"/>
+              <w:left w:type="dxa" w:w="120"/>
+              <w:bottom w:type="dxa" w:w="70"/>
+              <w:right w:type="dxa" w:w="120"/>
+            </w:tcMar>
+          </w:tcPr>
+          <w:p>
+            <w:pPr>
+              <w:spacing w:after="0" w:line="252"/>
+            </w:pPr>
+            <w:r>
+              <w:rPr>
+                <w:sz w:val="20"/>
+                <w:szCs w:val="20"/>
+              </w:rPr>
+              <w:t xml:space="preserve">https://api.x.ai/v1</w:t>
+            </w:r>
+          </w:p>
+        </w:tc>
+        <w:tc>
+          <w:tcPr>
+            <w:tcW w:type="dxa" w:w="2900"/>
+            <w:shd w:fill="FFFFFF" w:val="clear"/>
+            <w:tcMar>
+              <w:top w:type="dxa" w:w="70"/>
+              <w:left w:type="dxa" w:w="120"/>
+              <w:bottom w:type="dxa" w:w="70"/>
+              <w:right w:type="dxa" w:w="120"/>
+            </w:tcMar>
+          </w:tcPr>
+          <w:p>
+            <w:pPr>
+              <w:spacing w:after="0" w:line="252"/>
+            </w:pPr>
+            <w:r>
+              <w:rPr>
+                <w:sz w:val="20"/>
+                <w:szCs w:val="20"/>
+              </w:rPr>
+              <w:t xml:space="preserve">grok-2-latest</w:t>
+            </w:r>
+          </w:p>
+        </w:tc>
+      </w:tr>
+    </w:tbl>
+    <w:p>
+      <w:pPr>
+        <w:spacing w:after="60"/>
+      </w:pPr>
+      <w:r>
+        <w:t xml:space="preserve"/>
+      </w:r>
+    </w:p>
+    <w:p>
+      <w:pPr>
+        <w:spacing w:after="140" w:line="276"/>
+      </w:pPr>
+      <w:r>
+        <w:t xml:space="preserve">This adapter is a </w:t>
+      </w:r>
+      <w:r>
+        <w:rPr>
+          <w:b/>
+          <w:bCs/>
+        </w:rPr>
+        <w:t xml:space="preserve">full, independent</w:t>
+      </w:r>
+      <w:r>
+        <w:t xml:space="preserve"> tool-calling loop — not a thin translation over the Gemini caller — because OpenAI's </w:t>
+      </w:r>
+      <w:r>
+        <w:rPr>
+          <w:rFonts w:ascii="Consolas" w:cs="Consolas" w:eastAsia="Consolas" w:hAnsi="Consolas"/>
+          <w:color w:val="B91C1C"/>
+          <w:sz w:val="19"/>
+          <w:szCs w:val="19"/>
+        </w:rPr>
+        <w:t xml:space="preserve">tool_calls</w:t>
+      </w:r>
+      <w:r>
+        <w:t xml:space="preserve"> mechanism is structurally different from Gemini's part-based </w:t>
+      </w:r>
+      <w:r>
+        <w:rPr>
+          <w:rFonts w:ascii="Consolas" w:cs="Consolas" w:eastAsia="Consolas" w:hAnsi="Consolas"/>
+          <w:color w:val="B91C1C"/>
+          <w:sz w:val="19"/>
+          <w:szCs w:val="19"/>
+        </w:rPr>
+        <w:t xml:space="preserve">functionCall</w:t>
+      </w:r>
+      <w:r>
+        <w:t xml:space="preserve"> / </w:t>
+      </w:r>
+      <w:r>
+        <w:rPr>
+          <w:rFonts w:ascii="Consolas" w:cs="Consolas" w:eastAsia="Consolas" w:hAnsi="Consolas"/>
+          <w:color w:val="B91C1C"/>
+          <w:sz w:val="19"/>
+          <w:szCs w:val="19"/>
+        </w:rPr>
+        <w:t xml:space="preserve">functionResponse</w:t>
+      </w:r>
+      <w:r>
+        <w:t xml:space="preserve"> id-echo. It still mirrors the same safety habits you saw earlier: it forces a tool call on round 1 (</w:t>
+      </w:r>
+      <w:r>
+        <w:rPr>
+          <w:rFonts w:ascii="Consolas" w:cs="Consolas" w:eastAsia="Consolas" w:hAnsi="Consolas"/>
+          <w:color w:val="B91C1C"/>
+          <w:sz w:val="19"/>
+          <w:szCs w:val="19"/>
+        </w:rPr>
+        <w:t xml:space="preserve">tool_choice: 'required'</w:t>
+      </w:r>
+      <w:r>
+        <w:t xml:space="preserve">), does a final forced synthesis if the rounds run out, and retries once on a </w:t>
+      </w:r>
+      <w:r>
+        <w:rPr>
+          <w:rFonts w:ascii="Consolas" w:cs="Consolas" w:eastAsia="Consolas" w:hAnsi="Consolas"/>
+          <w:color w:val="B91C1C"/>
+          <w:sz w:val="19"/>
+          <w:szCs w:val="19"/>
+        </w:rPr>
+        <w:t xml:space="preserve">429</w:t>
+      </w:r>
+      <w:r>
+        <w:t xml:space="preserve"> rate limit.</w:t>
+      </w:r>
+    </w:p>
+    <w:p>
+      <w:pPr>
+        <w:spacing w:after="140" w:line="276"/>
+      </w:pPr>
+      <w:r>
+        <w:t xml:space="preserve">A tool declaration is translated to OpenAI's shape on the way out — the same tools from the registry work for every provider:</w:t>
+      </w:r>
+    </w:p>
+    <w:tbl>
+      <w:tblPr>
+        <w:tblW w:type="dxa" w:w="9360"/>
+        <w:tblBorders>
+          <w:top w:val="single" w:color="D1D5DB" w:sz="4"/>
+          <w:left w:val="single" w:color="2E75B6" w:sz="12"/>
+          <w:bottom w:val="single" w:color="D1D5DB" w:sz="4"/>
+          <w:right w:val="single" w:color="D1D5DB" w:sz="4"/>
+          <w:insideH w:val="none"/>
+          <w:insideV w:val="none"/>
+        </w:tblBorders>
+      </w:tblPr>
+      <w:tblGrid>
+        <w:gridCol w:w="9360"/>
+      </w:tblGrid>
+      <w:tr>
+        <w:tc>
+          <w:tcPr>
+            <w:tcW w:type="dxa" w:w="9360"/>
+            <w:shd w:fill="F3F4F6" w:val="clear"/>
+            <w:tcMar>
+              <w:top w:type="dxa" w:w="100"/>
+              <w:left w:type="dxa" w:w="160"/>
+              <w:bottom w:type="dxa" w:w="100"/>
+              <w:right w:type="dxa" w:w="120"/>
+            </w:tcMar>
+          </w:tcPr>
+          <w:p>
+            <w:pPr>
+              <w:spacing w:after="0" w:line="250"/>
+            </w:pPr>
+            <w:r>
+              <w:rPr>
+                <w:rFonts w:ascii="Consolas" w:cs="Consolas" w:eastAsia="Consolas" w:hAnsi="Consolas"/>
+                <w:color w:val="1F2937"/>
+                <w:sz w:val="18"/>
+                <w:szCs w:val="18"/>
+              </w:rPr>
+              <w:t xml:space="preserve">// Gemini declaration  -&gt;  OpenAI 'function' tool</w:t>
+            </w:r>
+          </w:p>
+          <w:p>
+            <w:pPr>
+              <w:spacing w:after="0" w:line="250"/>
+            </w:pPr>
+            <w:r>
+              <w:rPr>
+                <w:rFonts w:ascii="Consolas" w:cs="Consolas" w:eastAsia="Consolas" w:hAnsi="Consolas"/>
+                <w:color w:val="1F2937"/>
+                <w:sz w:val="18"/>
+                <w:szCs w:val="18"/>
+              </w:rPr>
+              <w:t xml:space="preserve">{ type: 'function', function: {</w:t>
+            </w:r>
+          </w:p>
+          <w:p>
+            <w:pPr>
+              <w:spacing w:after="0" w:line="250"/>
+            </w:pPr>
+            <w:r>
+              <w:rPr>
+                <w:rFonts w:ascii="Consolas" w:cs="Consolas" w:eastAsia="Consolas" w:hAnsi="Consolas"/>
+                <w:color w:val="1F2937"/>
+                <w:sz w:val="18"/>
+                <w:szCs w:val="18"/>
+              </w:rPr>
+              <w:t xml:space="preserve">    name: declaration.name,</w:t>
+            </w:r>
+          </w:p>
+          <w:p>
+            <w:pPr>
+              <w:spacing w:after="0" w:line="250"/>
+            </w:pPr>
+            <w:r>
+              <w:rPr>
+                <w:rFonts w:ascii="Consolas" w:cs="Consolas" w:eastAsia="Consolas" w:hAnsi="Consolas"/>
+                <w:color w:val="1F2937"/>
+                <w:sz w:val="18"/>
+                <w:szCs w:val="18"/>
+              </w:rPr>
+              <w:t xml:space="preserve">    description: declaration.description,</w:t>
+            </w:r>
+          </w:p>
+          <w:p>
+            <w:pPr>
+              <w:spacing w:after="0" w:line="250"/>
+            </w:pPr>
+            <w:r>
+              <w:rPr>
+                <w:rFonts w:ascii="Consolas" w:cs="Consolas" w:eastAsia="Consolas" w:hAnsi="Consolas"/>
+                <w:color w:val="1F2937"/>
+                <w:sz w:val="18"/>
+                <w:szCs w:val="18"/>
+              </w:rPr>
+              <w:t xml:space="preserve">    parameters: declaration.parameters ?? { type: 'object', properties: {} },</w:t>
+            </w:r>
+          </w:p>
+          <w:p>
+            <w:pPr>
+              <w:spacing w:after="0" w:line="250"/>
+            </w:pPr>
+            <w:r>
+              <w:rPr>
+                <w:rFonts w:ascii="Consolas" w:cs="Consolas" w:eastAsia="Consolas" w:hAnsi="Consolas"/>
+                <w:color w:val="1F2937"/>
+                <w:sz w:val="18"/>
+                <w:szCs w:val="18"/>
+              </w:rPr>
+              <w:t xml:space="preserve">} }</w:t>
+            </w:r>
+          </w:p>
+        </w:tc>
+      </w:tr>
+    </w:tbl>
+    <w:tbl>
+      <w:tblPr>
+        <w:tblW w:type="dxa" w:w="9360"/>
+        <w:tblBorders>
+          <w:top w:val="single" w:color="D7E3F4" w:sz="4"/>
+          <w:left w:val="single" w:color="2E75B6" w:sz="16"/>
+          <w:bottom w:val="single" w:color="D7E3F4" w:sz="4"/>
+          <w:right w:val="single" w:color="D7E3F4" w:sz="4"/>
+          <w:insideH w:val="none"/>
+          <w:insideV w:val="none"/>
+        </w:tblBorders>
+      </w:tblPr>
+      <w:tblGrid>
+        <w:gridCol w:w="9360"/>
+      </w:tblGrid>
+      <w:tr>
+        <w:tc>
+          <w:tcPr>
+            <w:tcW w:type="dxa" w:w="9360"/>
+            <w:shd w:fill="EAF2FB" w:val="clear"/>
+            <w:tcMar>
+              <w:top w:type="dxa" w:w="120"/>
+              <w:left w:type="dxa" w:w="160"/>
+              <w:bottom w:type="dxa" w:w="120"/>
+              <w:right w:type="dxa" w:w="160"/>
+            </w:tcMar>
+          </w:tcPr>
+          <w:p>
+            <w:pPr>
+              <w:spacing w:after="60"/>
+            </w:pPr>
+            <w:r>
+              <w:rPr>
+                <w:b/>
+                <w:bCs/>
+                <w:color w:val="1F4E79"/>
+                <w:sz w:val="21"/>
+                <w:szCs w:val="21"/>
+              </w:rPr>
+              <w:t xml:space="preserve">Honest feature degradation</w:t>
+            </w:r>
+          </w:p>
+          <w:p>
+            <w:pPr>
+              <w:spacing w:after="60" w:line="270"/>
+            </w:pPr>
+            <w:r>
+              <w:t xml:space="preserve">Two Gemini-only features have no OpenAI-compatible equivalent: enableSearch (Gemini's built-in Google Search grounding) and thinkingLevel. Rather than break, the adapter simply ignores them. So an answer from Groq is still correct and grounded in your tool data — it just can't use Google-Search grounding. The system degrades a capability instead of failing.</w:t>
+            </w:r>
+          </w:p>
+        </w:tc>
+      </w:tr>
+    </w:tbl>
+    <w:p>
+      <w:pPr>
+        <w:spacing w:after="140" w:line="276"/>
+      </w:pPr>
+      <w:r>
+        <w:t xml:space="preserve">All of this hides behind one tiny interface, </w:t>
+      </w:r>
+      <w:r>
+        <w:rPr>
+          <w:rFonts w:ascii="Consolas" w:cs="Consolas" w:eastAsia="Consolas" w:hAnsi="Consolas"/>
+          <w:color w:val="B91C1C"/>
+          <w:sz w:val="19"/>
+          <w:szCs w:val="19"/>
+        </w:rPr>
+        <w:t xml:space="preserve">LlmToolCallerAdapter</w:t>
+      </w:r>
+      <w:r>
+        <w:t xml:space="preserve"> (</w:t>
+      </w:r>
+      <w:r>
+        <w:rPr>
+          <w:rFonts w:ascii="Consolas" w:cs="Consolas" w:eastAsia="Consolas" w:hAnsi="Consolas"/>
+          <w:color w:val="B91C1C"/>
+          <w:sz w:val="19"/>
+          <w:szCs w:val="19"/>
+        </w:rPr>
+        <w:t xml:space="preserve">providerName</w:t>
+      </w:r>
+      <w:r>
+        <w:t xml:space="preserve">, </w:t>
+      </w:r>
+      <w:r>
+        <w:rPr>
+          <w:rFonts w:ascii="Consolas" w:cs="Consolas" w:eastAsia="Consolas" w:hAnsi="Consolas"/>
+          <w:color w:val="B91C1C"/>
+          <w:sz w:val="19"/>
+          <w:szCs w:val="19"/>
+        </w:rPr>
+        <w:t xml:space="preserve">isConfigured()</w:t>
+      </w:r>
+      <w:r>
+        <w:t xml:space="preserve">, </w:t>
+      </w:r>
+      <w:r>
+        <w:rPr>
+          <w:rFonts w:ascii="Consolas" w:cs="Consolas" w:eastAsia="Consolas" w:hAnsi="Consolas"/>
+          <w:color w:val="B91C1C"/>
+          <w:sz w:val="19"/>
+          <w:szCs w:val="19"/>
+        </w:rPr>
+        <w:t xml:space="preserve">call()</w:t>
+      </w:r>
+      <w:r>
+        <w:t xml:space="preserve">), which is the seam the orchestrator uses. Adding tomorrow's LLM is: implement that interface (or reuse the OpenAI-compatible adapter), register it, and add its name to the provider order. No specialist changes.</w:t>
+      </w:r>
+    </w:p>
+    <w:p>
+      <w:pPr>
+        <w:pStyle w:val="Heading2"/>
+      </w:pPr>
+      <w:r>
         <w:t xml:space="preserve">Two flavours of specialist</w:t>
       </w:r>
     </w:p>
@@ -16482,7 +17735,17 @@
         <w:t xml:space="preserve">Leave agent</w:t>
       </w:r>
       <w:r>
-        <w:t xml:space="preserve"> — its self-guards pass (you're asking about your own data). It gets the leave tools and calls the Gemini tool-caller.</w:t>
+        <w:t xml:space="preserve"> — its self-guards pass (you're asking about your own data). It gets the leave tools and calls the </w:t>
+      </w:r>
+      <w:r>
+        <w:rPr>
+          <w:b/>
+          <w:bCs/>
+        </w:rPr>
+        <w:t xml:space="preserve">LLM orchestrator</w:t>
+      </w:r>
+      <w:r>
+        <w:t xml:space="preserve">, which picks a provider (Gemini, or a fail-over like Groq).</w:t>
       </w:r>
     </w:p>
     <w:p>
@@ -16502,7 +17765,7 @@
         <w:t xml:space="preserve">Tool call</w:t>
       </w:r>
       <w:r>
-        <w:t xml:space="preserve"> — Gemini calls </w:t>
+        <w:t xml:space="preserve"> — the LLM calls </w:t>
       </w:r>
       <w:r>
         <w:rPr>
@@ -16534,7 +17797,7 @@
         <w:t xml:space="preserve">Answer composed</w:t>
       </w:r>
       <w:r>
-        <w:t xml:space="preserve"> — Gemini reads the data and writes: “You have 12 annual leave days remaining...” grounded entirely in the real numbers.</w:t>
+        <w:t xml:space="preserve"> — the LLM reads the data and writes: “You have 12 annual leave days remaining...” grounded entirely in the real numbers.</w:t>
       </w:r>
     </w:p>
     <w:p>
@@ -17892,10 +19155,10 @@
           <w:b/>
           <w:bCs/>
         </w:rPr>
-        <w:t xml:space="preserve">tool-calling loop</w:t>
-      </w:r>
-      <w:r>
-        <w:t xml:space="preserve"> where Gemini fetches your real data from HR Core under your own permissions (10–13), before the answer is composed and returned (14–17).</w:t>
+        <w:t xml:space="preserve">LLM orchestrator's tool-calling loop</w:t>
+      </w:r>
+      <w:r>
+        <w:t xml:space="preserve"> — where the chosen provider (Gemini, or a fail-over such as Groq) fetches your real data from HR Core under your own permissions (10–13) — before the answer is composed and returned (14–17).</w:t>
       </w:r>
     </w:p>
     <w:p>
@@ -17957,7 +19220,7 @@
           <w:sz w:val="18"/>
           <w:szCs w:val="18"/>
         </w:rPr>
-        <w:t xml:space="preserve">Figure 1 — Request sequence across the Sentient AI module (user prompt → guardrails → intent classifier → specialist → tool registry → Gemini tool-caller → HR Core → final answer).</w:t>
+        <w:t xml:space="preserve">Figure 1 — Request sequence across the Sentient AI module (user prompt → guardrails → intent classifier → specialist → tool registry → LLM orchestrator: Gemini/Groq → HR Core → final answer).</w:t>
       </w:r>
     </w:p>
     <w:sectPr>

</xml_diff>